<commit_message>
Enhance README with detailed Intune deployment instructions and add ADMX templates for Group Policy management
</commit_message>
<xml_diff>
--- a/docs/Cowork_M365_Safety_Guide.docx
+++ b/docs/Cowork_M365_Safety_Guide.docx
@@ -42,7 +42,43 @@
           <w:sz w:val="20"/>
           <w:szCs w:val="20"/>
         </w:rPr>
-        <w:t>Version 1.0  •  March 2026  •  IT &amp; Security Team</w:t>
+        <w:t xml:space="preserve">Version </w:t>
+      </w:r>
+      <w:proofErr w:type="gramStart"/>
+      <w:r>
+        <w:rPr>
+          <w:color w:val="595959"/>
+          <w:sz w:val="20"/>
+          <w:szCs w:val="20"/>
+        </w:rPr>
+        <w:t>1.0  •</w:t>
+      </w:r>
+      <w:proofErr w:type="gramEnd"/>
+      <w:r>
+        <w:rPr>
+          <w:color w:val="595959"/>
+          <w:sz w:val="20"/>
+          <w:szCs w:val="20"/>
+        </w:rPr>
+        <w:t xml:space="preserve">  March </w:t>
+      </w:r>
+      <w:proofErr w:type="gramStart"/>
+      <w:r>
+        <w:rPr>
+          <w:color w:val="595959"/>
+          <w:sz w:val="20"/>
+          <w:szCs w:val="20"/>
+        </w:rPr>
+        <w:t>2026  •</w:t>
+      </w:r>
+      <w:proofErr w:type="gramEnd"/>
+      <w:r>
+        <w:rPr>
+          <w:color w:val="595959"/>
+          <w:sz w:val="20"/>
+          <w:szCs w:val="20"/>
+        </w:rPr>
+        <w:t xml:space="preserve">  IT &amp; Security Team</w:t>
       </w:r>
     </w:p>
     <w:tbl>
@@ -66,12 +102,6 @@
         <w:gridCol w:w="9360"/>
       </w:tblGrid>
       <w:tr>
-        <w:tblPrEx>
-          <w:tblCellMar>
-            <w:top w:w="0" w:type="dxa"/>
-            <w:bottom w:w="0" w:type="dxa"/>
-          </w:tblCellMar>
-        </w:tblPrEx>
         <w:tc>
           <w:tcPr>
             <w:tcW w:w="9360" w:type="dxa"/>
@@ -99,7 +129,25 @@
                 <w:bCs/>
                 <w:color w:val="1F4E79"/>
               </w:rPr>
-              <w:t>⚠️  Intended Audience</w:t>
+              <w:t>⚠</w:t>
+            </w:r>
+            <w:proofErr w:type="gramStart"/>
+            <w:r>
+              <w:rPr>
+                <w:b/>
+                <w:bCs/>
+                <w:color w:val="1F4E79"/>
+              </w:rPr>
+              <w:t>️  Intended</w:t>
+            </w:r>
+            <w:proofErr w:type="gramEnd"/>
+            <w:r>
+              <w:rPr>
+                <w:b/>
+                <w:bCs/>
+                <w:color w:val="1F4E79"/>
+              </w:rPr>
+              <w:t xml:space="preserve"> Audience</w:t>
             </w:r>
           </w:p>
           <w:p>
@@ -156,7 +204,25 @@
                 <w:sz w:val="20"/>
                 <w:szCs w:val="20"/>
               </w:rPr>
-              <w:t>particularly relevant for anyone working with large shared document libraries or SharePoint site collections.</w:t>
+              <w:t xml:space="preserve">particularly relevant for anyone working with </w:t>
+            </w:r>
+            <w:proofErr w:type="gramStart"/>
+            <w:r>
+              <w:rPr>
+                <w:color w:val="1F4E79"/>
+                <w:sz w:val="20"/>
+                <w:szCs w:val="20"/>
+              </w:rPr>
+              <w:t>large shared</w:t>
+            </w:r>
+            <w:proofErr w:type="gramEnd"/>
+            <w:r>
+              <w:rPr>
+                <w:color w:val="1F4E79"/>
+                <w:sz w:val="20"/>
+                <w:szCs w:val="20"/>
+              </w:rPr>
+              <w:t xml:space="preserve"> document libraries or SharePoint site collections.</w:t>
             </w:r>
           </w:p>
         </w:tc>
@@ -235,10 +301,7 @@
         <w:pStyle w:val="Heading2"/>
       </w:pPr>
       <w:r>
-        <w:t>1.1 What</w:t>
-      </w:r>
-      <w:r>
-        <w:t xml:space="preserve"> </w:t>
+        <w:t xml:space="preserve">1.1 What </w:t>
       </w:r>
       <w:proofErr w:type="spellStart"/>
       <w:r>
@@ -290,12 +353,6 @@
         <w:gridCol w:w="4680"/>
       </w:tblGrid>
       <w:tr>
-        <w:tblPrEx>
-          <w:tblCellMar>
-            <w:top w:w="0" w:type="dxa"/>
-            <w:bottom w:w="0" w:type="dxa"/>
-          </w:tblCellMar>
-        </w:tblPrEx>
         <w:tc>
           <w:tcPr>
             <w:tcW w:w="4680" w:type="dxa"/>
@@ -384,12 +441,6 @@
         </w:tc>
       </w:tr>
       <w:tr>
-        <w:tblPrEx>
-          <w:tblCellMar>
-            <w:top w:w="0" w:type="dxa"/>
-            <w:bottom w:w="0" w:type="dxa"/>
-          </w:tblCellMar>
-        </w:tblPrEx>
         <w:tc>
           <w:tcPr>
             <w:tcW w:w="4680" w:type="dxa"/>
@@ -589,10 +640,7 @@
         <w:pStyle w:val="Heading2"/>
       </w:pPr>
       <w:r>
-        <w:t>2.1 How</w:t>
-      </w:r>
-      <w:r>
-        <w:t xml:space="preserve"> M365 Content Reaches Your Local Machine</w:t>
+        <w:t>2.1 How M365 Content Reaches Your Local Machine</w:t>
       </w:r>
     </w:p>
     <w:p>
@@ -788,10 +836,7 @@
         <w:pStyle w:val="Heading2"/>
       </w:pPr>
       <w:r>
-        <w:t>2.2 Why</w:t>
-      </w:r>
-      <w:r>
-        <w:t xml:space="preserve"> This Matters</w:t>
+        <w:t>2.2 Why This Matters</w:t>
       </w:r>
     </w:p>
     <w:p>
@@ -854,12 +899,6 @@
         <w:gridCol w:w="9360"/>
       </w:tblGrid>
       <w:tr>
-        <w:tblPrEx>
-          <w:tblCellMar>
-            <w:top w:w="0" w:type="dxa"/>
-            <w:bottom w:w="0" w:type="dxa"/>
-          </w:tblCellMar>
-        </w:tblPrEx>
         <w:tc>
           <w:tcPr>
             <w:tcW w:w="9360" w:type="dxa"/>
@@ -1012,10 +1051,7 @@
         <w:pStyle w:val="Heading2"/>
       </w:pPr>
       <w:r>
-        <w:t>3.1 Principle</w:t>
-      </w:r>
-      <w:r>
-        <w:t xml:space="preserve"> of Least Access</w:t>
+        <w:t>3.1 Principle of Least Access</w:t>
       </w:r>
     </w:p>
     <w:p>
@@ -1066,12 +1102,6 @@
         <w:gridCol w:w="4680"/>
       </w:tblGrid>
       <w:tr>
-        <w:tblPrEx>
-          <w:tblCellMar>
-            <w:top w:w="0" w:type="dxa"/>
-            <w:bottom w:w="0" w:type="dxa"/>
-          </w:tblCellMar>
-        </w:tblPrEx>
         <w:tc>
           <w:tcPr>
             <w:tcW w:w="720" w:type="dxa"/>
@@ -1156,12 +1186,6 @@
         </w:tc>
       </w:tr>
       <w:tr>
-        <w:tblPrEx>
-          <w:tblCellMar>
-            <w:top w:w="0" w:type="dxa"/>
-            <w:bottom w:w="0" w:type="dxa"/>
-          </w:tblCellMar>
-        </w:tblPrEx>
         <w:tc>
           <w:tcPr>
             <w:tcW w:w="720" w:type="dxa"/>
@@ -1296,12 +1320,6 @@
         </w:tc>
       </w:tr>
       <w:tr>
-        <w:tblPrEx>
-          <w:tblCellMar>
-            <w:top w:w="0" w:type="dxa"/>
-            <w:bottom w:w="0" w:type="dxa"/>
-          </w:tblCellMar>
-        </w:tblPrEx>
         <w:tc>
           <w:tcPr>
             <w:tcW w:w="720" w:type="dxa"/>
@@ -1435,12 +1453,6 @@
         </w:tc>
       </w:tr>
       <w:tr>
-        <w:tblPrEx>
-          <w:tblCellMar>
-            <w:top w:w="0" w:type="dxa"/>
-            <w:bottom w:w="0" w:type="dxa"/>
-          </w:tblCellMar>
-        </w:tblPrEx>
         <w:tc>
           <w:tcPr>
             <w:tcW w:w="720" w:type="dxa"/>
@@ -1538,12 +1550,6 @@
         </w:tc>
       </w:tr>
       <w:tr>
-        <w:tblPrEx>
-          <w:tblCellMar>
-            <w:top w:w="0" w:type="dxa"/>
-            <w:bottom w:w="0" w:type="dxa"/>
-          </w:tblCellMar>
-        </w:tblPrEx>
         <w:tc>
           <w:tcPr>
             <w:tcW w:w="720" w:type="dxa"/>
@@ -1638,10 +1644,7 @@
         <w:pStyle w:val="Heading2"/>
       </w:pPr>
       <w:r>
-        <w:t>3.2 Review</w:t>
-      </w:r>
-      <w:r>
-        <w:t xml:space="preserve"> Before Confirming</w:t>
+        <w:t>3.2 Review Before Confirming</w:t>
       </w:r>
     </w:p>
     <w:p>
@@ -1668,10 +1671,7 @@
         <w:pStyle w:val="Heading2"/>
       </w:pPr>
       <w:r>
-        <w:t>3.3 Verify</w:t>
-      </w:r>
-      <w:r>
-        <w:t xml:space="preserve"> the Task Description</w:t>
+        <w:t>3.3 Verify the Task Description</w:t>
       </w:r>
     </w:p>
     <w:p>
@@ -1757,10 +1757,7 @@
         <w:pStyle w:val="Heading2"/>
       </w:pPr>
       <w:r>
-        <w:t>3.4 Understand</w:t>
-      </w:r>
-      <w:r>
-        <w:t xml:space="preserve"> Irreversible Actions</w:t>
+        <w:t>3.4 Understand Irreversible Actions</w:t>
       </w:r>
     </w:p>
     <w:p>
@@ -1797,12 +1794,6 @@
         <w:gridCol w:w="3120"/>
       </w:tblGrid>
       <w:tr>
-        <w:tblPrEx>
-          <w:tblCellMar>
-            <w:top w:w="0" w:type="dxa"/>
-            <w:bottom w:w="0" w:type="dxa"/>
-          </w:tblCellMar>
-        </w:tblPrEx>
         <w:tc>
           <w:tcPr>
             <w:tcW w:w="3120" w:type="dxa"/>
@@ -1898,12 +1889,6 @@
         </w:tc>
       </w:tr>
       <w:tr>
-        <w:tblPrEx>
-          <w:tblCellMar>
-            <w:top w:w="0" w:type="dxa"/>
-            <w:bottom w:w="0" w:type="dxa"/>
-          </w:tblCellMar>
-        </w:tblPrEx>
         <w:tc>
           <w:tcPr>
             <w:tcW w:w="3120" w:type="dxa"/>
@@ -1999,12 +1984,6 @@
         </w:tc>
       </w:tr>
       <w:tr>
-        <w:tblPrEx>
-          <w:tblCellMar>
-            <w:top w:w="0" w:type="dxa"/>
-            <w:bottom w:w="0" w:type="dxa"/>
-          </w:tblCellMar>
-        </w:tblPrEx>
         <w:tc>
           <w:tcPr>
             <w:tcW w:w="3120" w:type="dxa"/>
@@ -2032,8 +2011,18 @@
                 <w:sz w:val="20"/>
                 <w:szCs w:val="20"/>
               </w:rPr>
-              <w:t>Bulk rename</w:t>
-            </w:r>
+              <w:t xml:space="preserve">Bulk </w:t>
+            </w:r>
+            <w:proofErr w:type="gramStart"/>
+            <w:r>
+              <w:rPr>
+                <w:color w:val="595959"/>
+                <w:sz w:val="20"/>
+                <w:szCs w:val="20"/>
+              </w:rPr>
+              <w:t>rename</w:t>
+            </w:r>
+            <w:proofErr w:type="gramEnd"/>
           </w:p>
         </w:tc>
         <w:tc>
@@ -2100,12 +2089,6 @@
         </w:tc>
       </w:tr>
       <w:tr>
-        <w:tblPrEx>
-          <w:tblCellMar>
-            <w:top w:w="0" w:type="dxa"/>
-            <w:bottom w:w="0" w:type="dxa"/>
-          </w:tblCellMar>
-        </w:tblPrEx>
         <w:tc>
           <w:tcPr>
             <w:tcW w:w="3120" w:type="dxa"/>
@@ -2201,12 +2184,6 @@
         </w:tc>
       </w:tr>
       <w:tr>
-        <w:tblPrEx>
-          <w:tblCellMar>
-            <w:top w:w="0" w:type="dxa"/>
-            <w:bottom w:w="0" w:type="dxa"/>
-          </w:tblCellMar>
-        </w:tblPrEx>
         <w:tc>
           <w:tcPr>
             <w:tcW w:w="3120" w:type="dxa"/>
@@ -2302,12 +2279,6 @@
         </w:tc>
       </w:tr>
       <w:tr>
-        <w:tblPrEx>
-          <w:tblCellMar>
-            <w:top w:w="0" w:type="dxa"/>
-            <w:bottom w:w="0" w:type="dxa"/>
-          </w:tblCellMar>
-        </w:tblPrEx>
         <w:tc>
           <w:tcPr>
             <w:tcW w:w="3120" w:type="dxa"/>
@@ -2450,10 +2421,7 @@
         <w:pStyle w:val="Heading2"/>
       </w:pPr>
       <w:r>
-        <w:t>4.1 Scale</w:t>
-      </w:r>
-      <w:r>
-        <w:t xml:space="preserve"> Amplification</w:t>
+        <w:t>4.1 Scale Amplification</w:t>
       </w:r>
     </w:p>
     <w:p>
@@ -2502,12 +2470,6 @@
         <w:gridCol w:w="9360"/>
       </w:tblGrid>
       <w:tr>
-        <w:tblPrEx>
-          <w:tblCellMar>
-            <w:top w:w="0" w:type="dxa"/>
-            <w:bottom w:w="0" w:type="dxa"/>
-          </w:tblCellMar>
-        </w:tblPrEx>
         <w:tc>
           <w:tcPr>
             <w:tcW w:w="9360" w:type="dxa"/>
@@ -2529,13 +2491,23 @@
             <w:pPr>
               <w:spacing w:after="80"/>
             </w:pPr>
+            <w:proofErr w:type="gramStart"/>
             <w:r>
               <w:rPr>
                 <w:b/>
                 <w:bCs/>
                 <w:color w:val="1F4E79"/>
               </w:rPr>
-              <w:t>💡  Example Scenario</w:t>
+              <w:t>💡  Example</w:t>
+            </w:r>
+            <w:proofErr w:type="gramEnd"/>
+            <w:r>
+              <w:rPr>
+                <w:b/>
+                <w:bCs/>
+                <w:color w:val="1F4E79"/>
+              </w:rPr>
+              <w:t xml:space="preserve"> Scenario</w:t>
             </w:r>
           </w:p>
           <w:p>
@@ -2608,10 +2580,7 @@
         <w:pStyle w:val="Heading2"/>
       </w:pPr>
       <w:r>
-        <w:t>4.2 Mixed</w:t>
-      </w:r>
-      <w:r>
-        <w:t xml:space="preserve"> Sensitivity Data</w:t>
+        <w:t>4.2 Mixed Sensitivity Data</w:t>
       </w:r>
     </w:p>
     <w:p>
@@ -2697,10 +2666,7 @@
         <w:pStyle w:val="Heading2"/>
       </w:pPr>
       <w:r>
-        <w:t>4.3 Performance</w:t>
-      </w:r>
-      <w:r>
-        <w:t xml:space="preserve"> and Sync Conflicts</w:t>
+        <w:t>4.3 Performance and Sync Conflicts</w:t>
       </w:r>
     </w:p>
     <w:p>
@@ -2812,10 +2778,7 @@
         <w:pStyle w:val="Heading2"/>
       </w:pPr>
       <w:r>
-        <w:t>4.4 Files</w:t>
-      </w:r>
-      <w:r>
-        <w:t xml:space="preserve"> On-Demand (Sparse Files)</w:t>
+        <w:t>4.4 Files On-Demand (Sparse Files)</w:t>
       </w:r>
     </w:p>
     <w:p>
@@ -2865,12 +2828,6 @@
         <w:gridCol w:w="9360"/>
       </w:tblGrid>
       <w:tr>
-        <w:tblPrEx>
-          <w:tblCellMar>
-            <w:top w:w="0" w:type="dxa"/>
-            <w:bottom w:w="0" w:type="dxa"/>
-          </w:tblCellMar>
-        </w:tblPrEx>
         <w:tc>
           <w:tcPr>
             <w:tcW w:w="9360" w:type="dxa"/>
@@ -3057,10 +3014,7 @@
         <w:pStyle w:val="Heading2"/>
       </w:pPr>
       <w:r>
-        <w:t>4.5 Accidental</w:t>
-      </w:r>
-      <w:r>
-        <w:t xml:space="preserve"> Scope Creep</w:t>
+        <w:t>4.5 Accidental Scope Creep</w:t>
       </w:r>
     </w:p>
     <w:p>
@@ -3201,10 +3155,7 @@
         <w:pStyle w:val="Heading2"/>
       </w:pPr>
       <w:r>
-        <w:t>5.1 Real</w:t>
-      </w:r>
-      <w:r>
-        <w:t>-Time Cloud Propagation</w:t>
+        <w:t>5.1 Real-Time Cloud Propagation</w:t>
       </w:r>
     </w:p>
     <w:p>
@@ -3237,10 +3188,7 @@
         <w:pStyle w:val="Heading2"/>
       </w:pPr>
       <w:r>
-        <w:t>5.2 Permission</w:t>
-      </w:r>
-      <w:r>
-        <w:t xml:space="preserve"> Inheritance and Broken Inheritance</w:t>
+        <w:t>5.2 Permission Inheritance and Broken Inheritance</w:t>
       </w:r>
     </w:p>
     <w:p>
@@ -3341,10 +3289,7 @@
       </w:pPr>
       <w:r>
         <w:lastRenderedPageBreak/>
-        <w:t>5.3 Sensitivity</w:t>
-      </w:r>
-      <w:r>
-        <w:t xml:space="preserve"> Labels (Microsoft Purview / MIP)</w:t>
+        <w:t>5.3 Sensitivity Labels (Microsoft Purview / MIP)</w:t>
       </w:r>
     </w:p>
     <w:p>
@@ -3393,12 +3338,6 @@
         <w:gridCol w:w="9360"/>
       </w:tblGrid>
       <w:tr>
-        <w:tblPrEx>
-          <w:tblCellMar>
-            <w:top w:w="0" w:type="dxa"/>
-            <w:bottom w:w="0" w:type="dxa"/>
-          </w:tblCellMar>
-        </w:tblPrEx>
         <w:tc>
           <w:tcPr>
             <w:tcW w:w="9360" w:type="dxa"/>
@@ -3435,15 +3374,7 @@
                 <w:bCs/>
                 <w:color w:val="C55A11"/>
               </w:rPr>
-              <w:t xml:space="preserve"> Sensitivity</w:t>
-            </w:r>
-            <w:r>
-              <w:rPr>
-                <w:b/>
-                <w:bCs/>
-                <w:color w:val="C55A11"/>
-              </w:rPr>
-              <w:t xml:space="preserve"> Labels – Important Caveats</w:t>
+              <w:t xml:space="preserve"> Sensitivity Labels – Important Caveats</w:t>
             </w:r>
           </w:p>
           <w:p>
@@ -3629,10 +3560,7 @@
         <w:pStyle w:val="Heading2"/>
       </w:pPr>
       <w:r>
-        <w:t>5.4 Version</w:t>
-      </w:r>
-      <w:r>
-        <w:t xml:space="preserve"> History and Audit Logs</w:t>
+        <w:t>5.4 Version History and Audit Logs</w:t>
       </w:r>
     </w:p>
     <w:p>
@@ -3754,10 +3682,7 @@
         <w:pStyle w:val="Heading2"/>
       </w:pPr>
       <w:r>
-        <w:t>5.5 Large</w:t>
-      </w:r>
-      <w:r>
-        <w:t xml:space="preserve"> List Threshold and Library Limits</w:t>
+        <w:t>5.5 Large List Threshold and Library Limits</w:t>
       </w:r>
     </w:p>
     <w:p>
@@ -3838,10 +3763,7 @@
         <w:pStyle w:val="Heading2"/>
       </w:pPr>
       <w:r>
-        <w:t>5.6 Shared</w:t>
-      </w:r>
-      <w:r>
-        <w:t xml:space="preserve"> Channels and External Collaboration</w:t>
+        <w:t>5.6 Shared Channels and External Collaboration</w:t>
       </w:r>
     </w:p>
     <w:p>
@@ -3916,10 +3838,7 @@
         <w:pStyle w:val="Heading2"/>
       </w:pPr>
       <w:r>
-        <w:t>6.1 Before</w:t>
-      </w:r>
-      <w:r>
-        <w:t xml:space="preserve"> You Start a Task</w:t>
+        <w:t>6.1 Before You Start a Task</w:t>
       </w:r>
     </w:p>
     <w:p>
@@ -4031,10 +3950,7 @@
         <w:pStyle w:val="Heading2"/>
       </w:pPr>
       <w:r>
-        <w:t>6.2 During</w:t>
-      </w:r>
-      <w:r>
-        <w:t xml:space="preserve"> a Task</w:t>
+        <w:t>6.2 During a Task</w:t>
       </w:r>
     </w:p>
     <w:p>
@@ -4158,10 +4074,7 @@
         <w:pStyle w:val="Heading2"/>
       </w:pPr>
       <w:r>
-        <w:t>6.3 After</w:t>
-      </w:r>
-      <w:r>
-        <w:t xml:space="preserve"> a Task</w:t>
+        <w:t>6.3 After a Task</w:t>
       </w:r>
     </w:p>
     <w:p>
@@ -4214,7 +4127,21 @@
         <w:rPr>
           <w:color w:val="595959"/>
         </w:rPr>
-        <w:t>If something went wrong, act quickly: SharePoint version history and the Recycle Bin are time-sensitive. Notify your SharePoint administrator promptly.</w:t>
+        <w:t xml:space="preserve">If something went wrong, act quickly: SharePoint version history and the Recycle Bin are </w:t>
+      </w:r>
+      <w:proofErr w:type="gramStart"/>
+      <w:r>
+        <w:rPr>
+          <w:color w:val="595959"/>
+        </w:rPr>
+        <w:t>time-sensitive</w:t>
+      </w:r>
+      <w:proofErr w:type="gramEnd"/>
+      <w:r>
+        <w:rPr>
+          <w:color w:val="595959"/>
+        </w:rPr>
+        <w:t>. Notify your SharePoint administrator promptly.</w:t>
       </w:r>
     </w:p>
     <w:p>
@@ -4227,10 +4154,7 @@
         <w:pStyle w:val="Heading2"/>
       </w:pPr>
       <w:r>
-        <w:t>6.4 Administrator</w:t>
-      </w:r>
-      <w:r>
-        <w:t xml:space="preserve"> Recommendations</w:t>
+        <w:t>6.4 Administrator Recommendations</w:t>
       </w:r>
     </w:p>
     <w:p>
@@ -4332,7 +4256,21 @@
         <w:rPr>
           <w:color w:val="595959"/>
         </w:rPr>
-        <w:t xml:space="preserve"> is not label-aware.</w:t>
+        <w:t xml:space="preserve"> is not </w:t>
+      </w:r>
+      <w:proofErr w:type="gramStart"/>
+      <w:r>
+        <w:rPr>
+          <w:color w:val="595959"/>
+        </w:rPr>
+        <w:t>label-aware</w:t>
+      </w:r>
+      <w:proofErr w:type="gramEnd"/>
+      <w:r>
+        <w:rPr>
+          <w:color w:val="595959"/>
+        </w:rPr>
+        <w:t>.</w:t>
       </w:r>
     </w:p>
     <w:p>
@@ -4514,12 +4452,6 @@
         <w:gridCol w:w="2160"/>
       </w:tblGrid>
       <w:tr>
-        <w:tblPrEx>
-          <w:tblCellMar>
-            <w:top w:w="0" w:type="dxa"/>
-            <w:bottom w:w="0" w:type="dxa"/>
-          </w:tblCellMar>
-        </w:tblPrEx>
         <w:tc>
           <w:tcPr>
             <w:tcW w:w="720" w:type="dxa"/>
@@ -4604,12 +4536,6 @@
         </w:tc>
       </w:tr>
       <w:tr>
-        <w:tblPrEx>
-          <w:tblCellMar>
-            <w:top w:w="0" w:type="dxa"/>
-            <w:bottom w:w="0" w:type="dxa"/>
-          </w:tblCellMar>
-        </w:tblPrEx>
         <w:tc>
           <w:tcPr>
             <w:tcW w:w="720" w:type="dxa"/>
@@ -4710,24 +4636,38 @@
             <w:pPr>
               <w:spacing w:before="60" w:after="60"/>
             </w:pPr>
-            <w:r>
-              <w:rPr>
-                <w:color w:val="595959"/>
-                <w:sz w:val="20"/>
-                <w:szCs w:val="20"/>
-              </w:rPr>
-              <w:t>☐  Yes     ☐  No</w:t>
-            </w:r>
+            <w:proofErr w:type="gramStart"/>
+            <w:r>
+              <w:rPr>
+                <w:color w:val="595959"/>
+                <w:sz w:val="20"/>
+                <w:szCs w:val="20"/>
+              </w:rPr>
+              <w:t>☐  Yes</w:t>
+            </w:r>
+            <w:proofErr w:type="gramEnd"/>
+            <w:r>
+              <w:rPr>
+                <w:color w:val="595959"/>
+                <w:sz w:val="20"/>
+                <w:szCs w:val="20"/>
+              </w:rPr>
+              <w:t xml:space="preserve">     </w:t>
+            </w:r>
+            <w:proofErr w:type="gramStart"/>
+            <w:r>
+              <w:rPr>
+                <w:color w:val="595959"/>
+                <w:sz w:val="20"/>
+                <w:szCs w:val="20"/>
+              </w:rPr>
+              <w:t>☐  No</w:t>
+            </w:r>
+            <w:proofErr w:type="gramEnd"/>
           </w:p>
         </w:tc>
       </w:tr>
       <w:tr>
-        <w:tblPrEx>
-          <w:tblCellMar>
-            <w:top w:w="0" w:type="dxa"/>
-            <w:bottom w:w="0" w:type="dxa"/>
-          </w:tblCellMar>
-        </w:tblPrEx>
         <w:tc>
           <w:tcPr>
             <w:tcW w:w="720" w:type="dxa"/>
@@ -4810,24 +4750,38 @@
             <w:pPr>
               <w:spacing w:before="60" w:after="60"/>
             </w:pPr>
-            <w:r>
-              <w:rPr>
-                <w:color w:val="595959"/>
-                <w:sz w:val="20"/>
-                <w:szCs w:val="20"/>
-              </w:rPr>
-              <w:t>☐  Yes     ☐  No</w:t>
-            </w:r>
+            <w:proofErr w:type="gramStart"/>
+            <w:r>
+              <w:rPr>
+                <w:color w:val="595959"/>
+                <w:sz w:val="20"/>
+                <w:szCs w:val="20"/>
+              </w:rPr>
+              <w:t>☐  Yes</w:t>
+            </w:r>
+            <w:proofErr w:type="gramEnd"/>
+            <w:r>
+              <w:rPr>
+                <w:color w:val="595959"/>
+                <w:sz w:val="20"/>
+                <w:szCs w:val="20"/>
+              </w:rPr>
+              <w:t xml:space="preserve">     </w:t>
+            </w:r>
+            <w:proofErr w:type="gramStart"/>
+            <w:r>
+              <w:rPr>
+                <w:color w:val="595959"/>
+                <w:sz w:val="20"/>
+                <w:szCs w:val="20"/>
+              </w:rPr>
+              <w:t>☐  No</w:t>
+            </w:r>
+            <w:proofErr w:type="gramEnd"/>
           </w:p>
         </w:tc>
       </w:tr>
       <w:tr>
-        <w:tblPrEx>
-          <w:tblCellMar>
-            <w:top w:w="0" w:type="dxa"/>
-            <w:bottom w:w="0" w:type="dxa"/>
-          </w:tblCellMar>
-        </w:tblPrEx>
         <w:tc>
           <w:tcPr>
             <w:tcW w:w="720" w:type="dxa"/>
@@ -4910,24 +4864,46 @@
             <w:pPr>
               <w:spacing w:before="60" w:after="60"/>
             </w:pPr>
-            <w:r>
-              <w:rPr>
-                <w:color w:val="595959"/>
-                <w:sz w:val="20"/>
-                <w:szCs w:val="20"/>
-              </w:rPr>
-              <w:t>☐  Yes     ☐  N/A</w:t>
+            <w:proofErr w:type="gramStart"/>
+            <w:r>
+              <w:rPr>
+                <w:color w:val="595959"/>
+                <w:sz w:val="20"/>
+                <w:szCs w:val="20"/>
+              </w:rPr>
+              <w:t>☐  Yes</w:t>
+            </w:r>
+            <w:proofErr w:type="gramEnd"/>
+            <w:r>
+              <w:rPr>
+                <w:color w:val="595959"/>
+                <w:sz w:val="20"/>
+                <w:szCs w:val="20"/>
+              </w:rPr>
+              <w:t xml:space="preserve">     </w:t>
+            </w:r>
+            <w:proofErr w:type="gramStart"/>
+            <w:r>
+              <w:rPr>
+                <w:color w:val="595959"/>
+                <w:sz w:val="20"/>
+                <w:szCs w:val="20"/>
+              </w:rPr>
+              <w:t>☐  N</w:t>
+            </w:r>
+            <w:proofErr w:type="gramEnd"/>
+            <w:r>
+              <w:rPr>
+                <w:color w:val="595959"/>
+                <w:sz w:val="20"/>
+                <w:szCs w:val="20"/>
+              </w:rPr>
+              <w:t>/A</w:t>
             </w:r>
           </w:p>
         </w:tc>
       </w:tr>
       <w:tr>
-        <w:tblPrEx>
-          <w:tblCellMar>
-            <w:top w:w="0" w:type="dxa"/>
-            <w:bottom w:w="0" w:type="dxa"/>
-          </w:tblCellMar>
-        </w:tblPrEx>
         <w:tc>
           <w:tcPr>
             <w:tcW w:w="720" w:type="dxa"/>
@@ -5010,24 +4986,38 @@
             <w:pPr>
               <w:spacing w:before="60" w:after="60"/>
             </w:pPr>
-            <w:r>
-              <w:rPr>
-                <w:color w:val="595959"/>
-                <w:sz w:val="20"/>
-                <w:szCs w:val="20"/>
-              </w:rPr>
-              <w:t>☐  Yes     ☐  No</w:t>
-            </w:r>
+            <w:proofErr w:type="gramStart"/>
+            <w:r>
+              <w:rPr>
+                <w:color w:val="595959"/>
+                <w:sz w:val="20"/>
+                <w:szCs w:val="20"/>
+              </w:rPr>
+              <w:t>☐  Yes</w:t>
+            </w:r>
+            <w:proofErr w:type="gramEnd"/>
+            <w:r>
+              <w:rPr>
+                <w:color w:val="595959"/>
+                <w:sz w:val="20"/>
+                <w:szCs w:val="20"/>
+              </w:rPr>
+              <w:t xml:space="preserve">     </w:t>
+            </w:r>
+            <w:proofErr w:type="gramStart"/>
+            <w:r>
+              <w:rPr>
+                <w:color w:val="595959"/>
+                <w:sz w:val="20"/>
+                <w:szCs w:val="20"/>
+              </w:rPr>
+              <w:t>☐  No</w:t>
+            </w:r>
+            <w:proofErr w:type="gramEnd"/>
           </w:p>
         </w:tc>
       </w:tr>
       <w:tr>
-        <w:tblPrEx>
-          <w:tblCellMar>
-            <w:top w:w="0" w:type="dxa"/>
-            <w:bottom w:w="0" w:type="dxa"/>
-          </w:tblCellMar>
-        </w:tblPrEx>
         <w:tc>
           <w:tcPr>
             <w:tcW w:w="720" w:type="dxa"/>
@@ -5110,24 +5100,46 @@
             <w:pPr>
               <w:spacing w:before="60" w:after="60"/>
             </w:pPr>
-            <w:r>
-              <w:rPr>
-                <w:color w:val="595959"/>
-                <w:sz w:val="20"/>
-                <w:szCs w:val="20"/>
-              </w:rPr>
-              <w:t>☐  Yes     ☐  N/A</w:t>
+            <w:proofErr w:type="gramStart"/>
+            <w:r>
+              <w:rPr>
+                <w:color w:val="595959"/>
+                <w:sz w:val="20"/>
+                <w:szCs w:val="20"/>
+              </w:rPr>
+              <w:t>☐  Yes</w:t>
+            </w:r>
+            <w:proofErr w:type="gramEnd"/>
+            <w:r>
+              <w:rPr>
+                <w:color w:val="595959"/>
+                <w:sz w:val="20"/>
+                <w:szCs w:val="20"/>
+              </w:rPr>
+              <w:t xml:space="preserve">     </w:t>
+            </w:r>
+            <w:proofErr w:type="gramStart"/>
+            <w:r>
+              <w:rPr>
+                <w:color w:val="595959"/>
+                <w:sz w:val="20"/>
+                <w:szCs w:val="20"/>
+              </w:rPr>
+              <w:t>☐  N</w:t>
+            </w:r>
+            <w:proofErr w:type="gramEnd"/>
+            <w:r>
+              <w:rPr>
+                <w:color w:val="595959"/>
+                <w:sz w:val="20"/>
+                <w:szCs w:val="20"/>
+              </w:rPr>
+              <w:t>/A</w:t>
             </w:r>
           </w:p>
         </w:tc>
       </w:tr>
       <w:tr>
-        <w:tblPrEx>
-          <w:tblCellMar>
-            <w:top w:w="0" w:type="dxa"/>
-            <w:bottom w:w="0" w:type="dxa"/>
-          </w:tblCellMar>
-        </w:tblPrEx>
         <w:tc>
           <w:tcPr>
             <w:tcW w:w="720" w:type="dxa"/>
@@ -5228,24 +5240,46 @@
             <w:pPr>
               <w:spacing w:before="60" w:after="60"/>
             </w:pPr>
-            <w:r>
-              <w:rPr>
-                <w:color w:val="595959"/>
-                <w:sz w:val="20"/>
-                <w:szCs w:val="20"/>
-              </w:rPr>
-              <w:t>☐  Yes     ☐  N/A</w:t>
+            <w:proofErr w:type="gramStart"/>
+            <w:r>
+              <w:rPr>
+                <w:color w:val="595959"/>
+                <w:sz w:val="20"/>
+                <w:szCs w:val="20"/>
+              </w:rPr>
+              <w:t>☐  Yes</w:t>
+            </w:r>
+            <w:proofErr w:type="gramEnd"/>
+            <w:r>
+              <w:rPr>
+                <w:color w:val="595959"/>
+                <w:sz w:val="20"/>
+                <w:szCs w:val="20"/>
+              </w:rPr>
+              <w:t xml:space="preserve">     </w:t>
+            </w:r>
+            <w:proofErr w:type="gramStart"/>
+            <w:r>
+              <w:rPr>
+                <w:color w:val="595959"/>
+                <w:sz w:val="20"/>
+                <w:szCs w:val="20"/>
+              </w:rPr>
+              <w:t>☐  N</w:t>
+            </w:r>
+            <w:proofErr w:type="gramEnd"/>
+            <w:r>
+              <w:rPr>
+                <w:color w:val="595959"/>
+                <w:sz w:val="20"/>
+                <w:szCs w:val="20"/>
+              </w:rPr>
+              <w:t>/A</w:t>
             </w:r>
           </w:p>
         </w:tc>
       </w:tr>
       <w:tr>
-        <w:tblPrEx>
-          <w:tblCellMar>
-            <w:top w:w="0" w:type="dxa"/>
-            <w:bottom w:w="0" w:type="dxa"/>
-          </w:tblCellMar>
-        </w:tblPrEx>
         <w:tc>
           <w:tcPr>
             <w:tcW w:w="720" w:type="dxa"/>
@@ -5328,24 +5362,38 @@
             <w:pPr>
               <w:spacing w:before="60" w:after="60"/>
             </w:pPr>
-            <w:r>
-              <w:rPr>
-                <w:color w:val="595959"/>
-                <w:sz w:val="20"/>
-                <w:szCs w:val="20"/>
-              </w:rPr>
-              <w:t>☐  Yes     ☐  No</w:t>
-            </w:r>
+            <w:proofErr w:type="gramStart"/>
+            <w:r>
+              <w:rPr>
+                <w:color w:val="595959"/>
+                <w:sz w:val="20"/>
+                <w:szCs w:val="20"/>
+              </w:rPr>
+              <w:t>☐  Yes</w:t>
+            </w:r>
+            <w:proofErr w:type="gramEnd"/>
+            <w:r>
+              <w:rPr>
+                <w:color w:val="595959"/>
+                <w:sz w:val="20"/>
+                <w:szCs w:val="20"/>
+              </w:rPr>
+              <w:t xml:space="preserve">     </w:t>
+            </w:r>
+            <w:proofErr w:type="gramStart"/>
+            <w:r>
+              <w:rPr>
+                <w:color w:val="595959"/>
+                <w:sz w:val="20"/>
+                <w:szCs w:val="20"/>
+              </w:rPr>
+              <w:t>☐  No</w:t>
+            </w:r>
+            <w:proofErr w:type="gramEnd"/>
           </w:p>
         </w:tc>
       </w:tr>
       <w:tr>
-        <w:tblPrEx>
-          <w:tblCellMar>
-            <w:top w:w="0" w:type="dxa"/>
-            <w:bottom w:w="0" w:type="dxa"/>
-          </w:tblCellMar>
-        </w:tblPrEx>
         <w:tc>
           <w:tcPr>
             <w:tcW w:w="720" w:type="dxa"/>
@@ -5446,24 +5494,38 @@
             <w:pPr>
               <w:spacing w:before="60" w:after="60"/>
             </w:pPr>
-            <w:r>
-              <w:rPr>
-                <w:color w:val="595959"/>
-                <w:sz w:val="20"/>
-                <w:szCs w:val="20"/>
-              </w:rPr>
-              <w:t>☐  Yes     ☐  No</w:t>
-            </w:r>
+            <w:proofErr w:type="gramStart"/>
+            <w:r>
+              <w:rPr>
+                <w:color w:val="595959"/>
+                <w:sz w:val="20"/>
+                <w:szCs w:val="20"/>
+              </w:rPr>
+              <w:t>☐  Yes</w:t>
+            </w:r>
+            <w:proofErr w:type="gramEnd"/>
+            <w:r>
+              <w:rPr>
+                <w:color w:val="595959"/>
+                <w:sz w:val="20"/>
+                <w:szCs w:val="20"/>
+              </w:rPr>
+              <w:t xml:space="preserve">     </w:t>
+            </w:r>
+            <w:proofErr w:type="gramStart"/>
+            <w:r>
+              <w:rPr>
+                <w:color w:val="595959"/>
+                <w:sz w:val="20"/>
+                <w:szCs w:val="20"/>
+              </w:rPr>
+              <w:t>☐  No</w:t>
+            </w:r>
+            <w:proofErr w:type="gramEnd"/>
           </w:p>
         </w:tc>
       </w:tr>
       <w:tr>
-        <w:tblPrEx>
-          <w:tblCellMar>
-            <w:top w:w="0" w:type="dxa"/>
-            <w:bottom w:w="0" w:type="dxa"/>
-          </w:tblCellMar>
-        </w:tblPrEx>
         <w:tc>
           <w:tcPr>
             <w:tcW w:w="720" w:type="dxa"/>
@@ -5546,24 +5608,46 @@
             <w:pPr>
               <w:spacing w:before="60" w:after="60"/>
             </w:pPr>
-            <w:r>
-              <w:rPr>
-                <w:color w:val="595959"/>
-                <w:sz w:val="20"/>
-                <w:szCs w:val="20"/>
-              </w:rPr>
-              <w:t>☐  Yes     ☐  N/A</w:t>
+            <w:proofErr w:type="gramStart"/>
+            <w:r>
+              <w:rPr>
+                <w:color w:val="595959"/>
+                <w:sz w:val="20"/>
+                <w:szCs w:val="20"/>
+              </w:rPr>
+              <w:t>☐  Yes</w:t>
+            </w:r>
+            <w:proofErr w:type="gramEnd"/>
+            <w:r>
+              <w:rPr>
+                <w:color w:val="595959"/>
+                <w:sz w:val="20"/>
+                <w:szCs w:val="20"/>
+              </w:rPr>
+              <w:t xml:space="preserve">     </w:t>
+            </w:r>
+            <w:proofErr w:type="gramStart"/>
+            <w:r>
+              <w:rPr>
+                <w:color w:val="595959"/>
+                <w:sz w:val="20"/>
+                <w:szCs w:val="20"/>
+              </w:rPr>
+              <w:t>☐  N</w:t>
+            </w:r>
+            <w:proofErr w:type="gramEnd"/>
+            <w:r>
+              <w:rPr>
+                <w:color w:val="595959"/>
+                <w:sz w:val="20"/>
+                <w:szCs w:val="20"/>
+              </w:rPr>
+              <w:t>/A</w:t>
             </w:r>
           </w:p>
         </w:tc>
       </w:tr>
       <w:tr>
-        <w:tblPrEx>
-          <w:tblCellMar>
-            <w:top w:w="0" w:type="dxa"/>
-            <w:bottom w:w="0" w:type="dxa"/>
-          </w:tblCellMar>
-        </w:tblPrEx>
         <w:tc>
           <w:tcPr>
             <w:tcW w:w="720" w:type="dxa"/>
@@ -5664,14 +5748,34 @@
             <w:pPr>
               <w:spacing w:before="60" w:after="60"/>
             </w:pPr>
-            <w:r>
-              <w:rPr>
-                <w:color w:val="595959"/>
-                <w:sz w:val="20"/>
-                <w:szCs w:val="20"/>
-              </w:rPr>
-              <w:t>☐  Yes     ☐  No</w:t>
-            </w:r>
+            <w:proofErr w:type="gramStart"/>
+            <w:r>
+              <w:rPr>
+                <w:color w:val="595959"/>
+                <w:sz w:val="20"/>
+                <w:szCs w:val="20"/>
+              </w:rPr>
+              <w:t>☐  Yes</w:t>
+            </w:r>
+            <w:proofErr w:type="gramEnd"/>
+            <w:r>
+              <w:rPr>
+                <w:color w:val="595959"/>
+                <w:sz w:val="20"/>
+                <w:szCs w:val="20"/>
+              </w:rPr>
+              <w:t xml:space="preserve">     </w:t>
+            </w:r>
+            <w:proofErr w:type="gramStart"/>
+            <w:r>
+              <w:rPr>
+                <w:color w:val="595959"/>
+                <w:sz w:val="20"/>
+                <w:szCs w:val="20"/>
+              </w:rPr>
+              <w:t>☐  No</w:t>
+            </w:r>
+            <w:proofErr w:type="gramEnd"/>
           </w:p>
         </w:tc>
       </w:tr>
@@ -5732,12 +5836,6 @@
         <w:gridCol w:w="9"/>
       </w:tblGrid>
       <w:tr>
-        <w:tblPrEx>
-          <w:tblCellMar>
-            <w:top w:w="0" w:type="dxa"/>
-            <w:bottom w:w="0" w:type="dxa"/>
-          </w:tblCellMar>
-        </w:tblPrEx>
         <w:trPr>
           <w:gridAfter w:val="1"/>
           <w:wAfter w:w="9" w:type="dxa"/>
@@ -5808,12 +5906,6 @@
         </w:tc>
       </w:tr>
       <w:tr>
-        <w:tblPrEx>
-          <w:tblCellMar>
-            <w:top w:w="0" w:type="dxa"/>
-            <w:bottom w:w="0" w:type="dxa"/>
-          </w:tblCellMar>
-        </w:tblPrEx>
         <w:trPr>
           <w:gridAfter w:val="1"/>
           <w:wAfter w:w="9" w:type="dxa"/>
@@ -5901,12 +5993,6 @@
         </w:tc>
       </w:tr>
       <w:tr>
-        <w:tblPrEx>
-          <w:tblCellMar>
-            <w:top w:w="0" w:type="dxa"/>
-            <w:bottom w:w="0" w:type="dxa"/>
-          </w:tblCellMar>
-        </w:tblPrEx>
         <w:trPr>
           <w:gridAfter w:val="1"/>
           <w:wAfter w:w="9" w:type="dxa"/>
@@ -5976,12 +6062,6 @@
         </w:tc>
       </w:tr>
       <w:tr>
-        <w:tblPrEx>
-          <w:tblCellMar>
-            <w:top w:w="0" w:type="dxa"/>
-            <w:bottom w:w="0" w:type="dxa"/>
-          </w:tblCellMar>
-        </w:tblPrEx>
         <w:trPr>
           <w:gridAfter w:val="1"/>
           <w:wAfter w:w="9" w:type="dxa"/>
@@ -6051,12 +6131,6 @@
         </w:tc>
       </w:tr>
       <w:tr>
-        <w:tblPrEx>
-          <w:tblCellMar>
-            <w:top w:w="0" w:type="dxa"/>
-            <w:bottom w:w="0" w:type="dxa"/>
-          </w:tblCellMar>
-        </w:tblPrEx>
         <w:trPr>
           <w:gridAfter w:val="1"/>
           <w:wAfter w:w="9" w:type="dxa"/>
@@ -6126,12 +6200,6 @@
         </w:tc>
       </w:tr>
       <w:tr>
-        <w:tblPrEx>
-          <w:tblCellMar>
-            <w:top w:w="0" w:type="dxa"/>
-            <w:bottom w:w="0" w:type="dxa"/>
-          </w:tblCellMar>
-        </w:tblPrEx>
         <w:trPr>
           <w:gridAfter w:val="1"/>
           <w:wAfter w:w="9" w:type="dxa"/>
@@ -6201,12 +6269,6 @@
         </w:tc>
       </w:tr>
       <w:tr>
-        <w:tblPrEx>
-          <w:tblCellMar>
-            <w:top w:w="0" w:type="dxa"/>
-            <w:bottom w:w="0" w:type="dxa"/>
-          </w:tblCellMar>
-        </w:tblPrEx>
         <w:trPr>
           <w:gridAfter w:val="1"/>
           <w:wAfter w:w="9" w:type="dxa"/>
@@ -6276,12 +6338,6 @@
         </w:tc>
       </w:tr>
       <w:tr>
-        <w:tblPrEx>
-          <w:tblCellMar>
-            <w:top w:w="0" w:type="dxa"/>
-            <w:bottom w:w="0" w:type="dxa"/>
-          </w:tblCellMar>
-        </w:tblPrEx>
         <w:trPr>
           <w:gridBefore w:val="1"/>
           <w:wBefore w:w="9" w:type="dxa"/>
@@ -6308,13 +6364,23 @@
             <w:pPr>
               <w:spacing w:after="80"/>
             </w:pPr>
+            <w:proofErr w:type="gramStart"/>
             <w:r>
               <w:rPr>
                 <w:b/>
                 <w:bCs/>
                 <w:color w:val="595959"/>
               </w:rPr>
-              <w:t>📋  Document Information</w:t>
+              <w:t>📋  Document</w:t>
+            </w:r>
+            <w:proofErr w:type="gramEnd"/>
+            <w:r>
+              <w:rPr>
+                <w:b/>
+                <w:bCs/>
+                <w:color w:val="595959"/>
+              </w:rPr>
+              <w:t xml:space="preserve"> Information</w:t>
             </w:r>
           </w:p>
           <w:p>
@@ -6377,6 +6443,7 @@
         </w:tc>
       </w:tr>
     </w:tbl>
+    <w:p/>
     <w:sectPr>
       <w:headerReference w:type="default" r:id="rId10"/>
       <w:footerReference w:type="default" r:id="rId11"/>
@@ -6574,7 +6641,24 @@
         <w:szCs w:val="18"/>
       </w:rPr>
       <w:tab/>
-      <w:t>CONFIDENTIAL  |  March 2026</w:t>
+    </w:r>
+    <w:proofErr w:type="gramStart"/>
+    <w:r>
+      <w:rPr>
+        <w:color w:val="595959"/>
+        <w:sz w:val="18"/>
+        <w:szCs w:val="18"/>
+      </w:rPr>
+      <w:t>CONFIDENTIAL  |</w:t>
+    </w:r>
+    <w:proofErr w:type="gramEnd"/>
+    <w:r>
+      <w:rPr>
+        <w:color w:val="595959"/>
+        <w:sz w:val="18"/>
+        <w:szCs w:val="18"/>
+      </w:rPr>
+      <w:t xml:space="preserve">  March 2026</w:t>
     </w:r>
   </w:p>
 </w:hdr>
@@ -7882,12 +7966,14 @@
 </file>
 
 <file path=customXml/item1.xml><?xml version="1.0" encoding="utf-8"?>
-<?mso-contentType ?>
-<FormTemplates xmlns="http://schemas.microsoft.com/sharepoint/v3/contenttype/forms">
-  <Display>DocumentLibraryForm</Display>
-  <Edit>DocumentLibraryForm</Edit>
-  <New>DocumentLibraryForm</New>
-</FormTemplates>
+<p:properties xmlns:p="http://schemas.microsoft.com/office/2006/metadata/properties" xmlns:xsi="http://www.w3.org/2001/XMLSchema-instance" xmlns:pc="http://schemas.microsoft.com/office/infopath/2007/PartnerControls">
+  <documentManagement>
+    <lcf76f155ced4ddcb4097134ff3c332f xmlns="be7d3cb8-055b-4b65-bdaf-2de357714b45">
+      <Terms xmlns="http://schemas.microsoft.com/office/infopath/2007/PartnerControls"/>
+    </lcf76f155ced4ddcb4097134ff3c332f>
+    <TaxCatchAll xmlns="7d401155-050d-4c56-ba09-af4e681c1f43" xsi:nil="true"/>
+  </documentManagement>
+</p:properties>
 </file>
 
 <file path=customXml/item2.xml><?xml version="1.0" encoding="utf-8"?>
@@ -8098,20 +8184,21 @@
 </file>
 
 <file path=customXml/item3.xml><?xml version="1.0" encoding="utf-8"?>
-<p:properties xmlns:p="http://schemas.microsoft.com/office/2006/metadata/properties" xmlns:xsi="http://www.w3.org/2001/XMLSchema-instance" xmlns:pc="http://schemas.microsoft.com/office/infopath/2007/PartnerControls">
-  <documentManagement>
-    <lcf76f155ced4ddcb4097134ff3c332f xmlns="be7d3cb8-055b-4b65-bdaf-2de357714b45">
-      <Terms xmlns="http://schemas.microsoft.com/office/infopath/2007/PartnerControls"/>
-    </lcf76f155ced4ddcb4097134ff3c332f>
-    <TaxCatchAll xmlns="7d401155-050d-4c56-ba09-af4e681c1f43" xsi:nil="true"/>
-  </documentManagement>
-</p:properties>
+<?mso-contentType ?>
+<FormTemplates xmlns="http://schemas.microsoft.com/sharepoint/v3/contenttype/forms">
+  <Display>DocumentLibraryForm</Display>
+  <Edit>DocumentLibraryForm</Edit>
+  <New>DocumentLibraryForm</New>
+</FormTemplates>
 </file>
 
 <file path=customXml/itemProps1.xml><?xml version="1.0" encoding="utf-8"?>
-<ds:datastoreItem xmlns:ds="http://schemas.openxmlformats.org/officeDocument/2006/customXml" ds:itemID="{66D380C5-5E05-469A-8793-A1A37E4150B9}">
+<ds:datastoreItem xmlns:ds="http://schemas.openxmlformats.org/officeDocument/2006/customXml" ds:itemID="{DF2816E4-17C5-4D0B-BFB1-CCF6B244E582}">
   <ds:schemaRefs>
-    <ds:schemaRef ds:uri="http://schemas.microsoft.com/sharepoint/v3/contenttype/forms"/>
+    <ds:schemaRef ds:uri="http://schemas.microsoft.com/office/2006/metadata/properties"/>
+    <ds:schemaRef ds:uri="http://schemas.microsoft.com/office/infopath/2007/PartnerControls"/>
+    <ds:schemaRef ds:uri="be7d3cb8-055b-4b65-bdaf-2de357714b45"/>
+    <ds:schemaRef ds:uri="7d401155-050d-4c56-ba09-af4e681c1f43"/>
   </ds:schemaRefs>
 </ds:datastoreItem>
 </file>
@@ -8136,12 +8223,9 @@
 </file>
 
 <file path=customXml/itemProps3.xml><?xml version="1.0" encoding="utf-8"?>
-<ds:datastoreItem xmlns:ds="http://schemas.openxmlformats.org/officeDocument/2006/customXml" ds:itemID="{DF2816E4-17C5-4D0B-BFB1-CCF6B244E582}">
+<ds:datastoreItem xmlns:ds="http://schemas.openxmlformats.org/officeDocument/2006/customXml" ds:itemID="{66D380C5-5E05-469A-8793-A1A37E4150B9}">
   <ds:schemaRefs>
-    <ds:schemaRef ds:uri="http://schemas.microsoft.com/office/2006/metadata/properties"/>
-    <ds:schemaRef ds:uri="http://schemas.microsoft.com/office/infopath/2007/PartnerControls"/>
-    <ds:schemaRef ds:uri="be7d3cb8-055b-4b65-bdaf-2de357714b45"/>
-    <ds:schemaRef ds:uri="7d401155-050d-4c56-ba09-af4e681c1f43"/>
+    <ds:schemaRef ds:uri="http://schemas.microsoft.com/sharepoint/v3/contenttype/forms"/>
   </ds:schemaRefs>
 </ds:datastoreItem>
 </file>
</xml_diff>